<commit_message>
docs: vincular enlace oficial de Google Slides
</commit_message>
<xml_diff>
--- a/informe/Tarea3_Grupo16_PauloDeLosReyes.docx
+++ b/informe/Tarea3_Grupo16_PauloDeLosReyes.docx
@@ -1900,10 +1900,10 @@
         <w:rPr>
           <w:b/>
         </w:rPr>
-        <w:t xml:space="preserve">Presentación Online (Canva / Genially): </w:t>
+        <w:t xml:space="preserve">Presentación Online (Google Slides): </w:t>
       </w:r>
       <w:r>
-        <w:t>https://www.canva.com/design/DAG.../view (Presentación visual con el problema, arquitectura y resumen de resultados).</w:t>
+        <w:t>https://docs.google.com/presentation/d/1MqQRxtU3fVPnxDnB2EPuVMmHrWjVB1EWMCfo44sE74U/edit?usp=sharing (Presentación visual con el problema, arquitectura y resumen de resultados).</w:t>
       </w:r>
     </w:p>
     <w:p>

</xml_diff>

<commit_message>
docs: anadir Figura 5 de streaming en word y pptx
</commit_message>
<xml_diff>
--- a/informe/Tarea3_Grupo16_PauloDeLosReyes.docx
+++ b/informe/Tarea3_Grupo16_PauloDeLosReyes.docx
@@ -1863,6 +1863,63 @@
       </w:r>
     </w:p>
     <w:p>
+      <w:r>
+        <w:drawing>
+          <wp:inline xmlns:a="http://schemas.openxmlformats.org/drawingml/2006/main" xmlns:pic="http://schemas.openxmlformats.org/drawingml/2006/picture">
+            <wp:extent cx="5669280" cy="2929128"/>
+            <wp:docPr id="5" name="Picture 5"/>
+            <wp:cNvGraphicFramePr>
+              <a:graphicFrameLocks noChangeAspect="1"/>
+            </wp:cNvGraphicFramePr>
+            <a:graphic>
+              <a:graphicData uri="http://schemas.openxmlformats.org/drawingml/2006/picture">
+                <pic:pic>
+                  <pic:nvPicPr>
+                    <pic:cNvPr id="0" name="figura5_streaming_kafka_spark.png"/>
+                    <pic:cNvPicPr/>
+                  </pic:nvPicPr>
+                  <pic:blipFill>
+                    <a:blip r:embed="rId13"/>
+                    <a:stretch>
+                      <a:fillRect/>
+                    </a:stretch>
+                  </pic:blipFill>
+                  <pic:spPr>
+                    <a:xfrm>
+                      <a:off x="0" y="0"/>
+                      <a:ext cx="5669280" cy="2929128"/>
+                    </a:xfrm>
+                    <a:prstGeom prst="rect"/>
+                  </pic:spPr>
+                </pic:pic>
+              </a:graphicData>
+            </a:graphic>
+          </wp:inline>
+        </w:drawing>
+      </w:r>
+    </w:p>
+    <w:p>
+      <w:pPr>
+        <w:jc w:val="center"/>
+      </w:pPr>
+      <w:r>
+        <w:rPr>
+          <w:i/>
+          <w:sz w:val="18"/>
+        </w:rPr>
+        <w:t>Figura 5: Evidencia Práctica de Ejecución en Paralelo (Productor Kafka, Consumidor Spark Streaming y Spark Web UI).</w:t>
+      </w:r>
+    </w:p>
+    <w:p>
+      <w:pPr>
+        <w:spacing w:line="276" w:lineRule="auto"/>
+        <w:jc w:val="both"/>
+      </w:pPr>
+      <w:r>
+        <w:t>Análisis Técnico (Figura 5): Se valida la ingesta continua de registros en el topic sensor_data y su posterior consumo en micro-batches. El operador de ventana deslizante consolida las medias de temperatura y humedad para cada sensor sin latencias de red, mientras la interfaz web en el puerto 4040 confirma la asignación de 2.0 GiB de RAM en el Driver y cero etapas fallidas.</w:t>
+      </w:r>
+    </w:p>
+    <w:p>
       <w:pPr>
         <w:pStyle w:val="Heading1"/>
       </w:pPr>

</xml_diff>

<commit_message>
Update presentation (10 slides), real terminal/Spark UI captures, and report
</commit_message>
<xml_diff>
--- a/informe/Tarea3_Grupo16_PauloDeLosReyes.docx
+++ b/informe/Tarea3_Grupo16_PauloDeLosReyes.docx
@@ -1600,7 +1600,7 @@
       <w:r>
         <w:drawing>
           <wp:inline xmlns:a="http://schemas.openxmlformats.org/drawingml/2006/main" xmlns:pic="http://schemas.openxmlformats.org/drawingml/2006/picture">
-            <wp:extent cx="4114800" cy="4114800"/>
+            <wp:extent cx="4114800" cy="2315026"/>
             <wp:docPr id="2" name="Picture 2"/>
             <wp:cNvGraphicFramePr>
               <a:graphicFrameLocks noChangeAspect="1"/>
@@ -1621,7 +1621,7 @@
                   <pic:spPr>
                     <a:xfrm>
                       <a:off x="0" y="0"/>
-                      <a:ext cx="4114800" cy="4114800"/>
+                      <a:ext cx="4114800" cy="2315026"/>
                     </a:xfrm>
                     <a:prstGeom prst="rect"/>
                   </pic:spPr>
@@ -1866,7 +1866,7 @@
       <w:r>
         <w:drawing>
           <wp:inline xmlns:a="http://schemas.openxmlformats.org/drawingml/2006/main" xmlns:pic="http://schemas.openxmlformats.org/drawingml/2006/picture">
-            <wp:extent cx="5669280" cy="2929128"/>
+            <wp:extent cx="5669280" cy="3099206"/>
             <wp:docPr id="5" name="Picture 5"/>
             <wp:cNvGraphicFramePr>
               <a:graphicFrameLocks noChangeAspect="1"/>
@@ -1875,7 +1875,7 @@
               <a:graphicData uri="http://schemas.openxmlformats.org/drawingml/2006/picture">
                 <pic:pic>
                   <pic:nvPicPr>
-                    <pic:cNvPr id="0" name="figura5_streaming_kafka_spark.png"/>
+                    <pic:cNvPr id="0" name="captura_kafka_instalacion_y_codigo.png"/>
                     <pic:cNvPicPr/>
                   </pic:nvPicPr>
                   <pic:blipFill>
@@ -1887,7 +1887,7 @@
                   <pic:spPr>
                     <a:xfrm>
                       <a:off x="0" y="0"/>
-                      <a:ext cx="5669280" cy="2929128"/>
+                      <a:ext cx="5669280" cy="3099206"/>
                     </a:xfrm>
                     <a:prstGeom prst="rect"/>
                   </pic:spPr>
@@ -1907,7 +1907,103 @@
           <w:i/>
           <w:sz w:val="18"/>
         </w:rPr>
-        <w:t>Figura 5: Evidencia Práctica de Ejecución en Paralelo (Productor Kafka, Consumidor Spark Streaming y Spark Web UI).</w:t>
+        <w:t>Figura 5: Arranque de ZooKeeper, Kafka Server, creación del topic sensor_data e implementación de scripts en Linux.</w:t>
+      </w:r>
+    </w:p>
+    <w:p>
+      <w:r>
+        <w:drawing>
+          <wp:inline xmlns:a="http://schemas.openxmlformats.org/drawingml/2006/main" xmlns:pic="http://schemas.openxmlformats.org/drawingml/2006/picture">
+            <wp:extent cx="5669280" cy="3099206"/>
+            <wp:docPr id="6" name="Picture 6"/>
+            <wp:cNvGraphicFramePr>
+              <a:graphicFrameLocks noChangeAspect="1"/>
+            </wp:cNvGraphicFramePr>
+            <a:graphic>
+              <a:graphicData uri="http://schemas.openxmlformats.org/drawingml/2006/picture">
+                <pic:pic>
+                  <pic:nvPicPr>
+                    <pic:cNvPr id="0" name="figura5_streaming_kafka_spark.png"/>
+                    <pic:cNvPicPr/>
+                  </pic:nvPicPr>
+                  <pic:blipFill>
+                    <a:blip r:embed="rId14"/>
+                    <a:stretch>
+                      <a:fillRect/>
+                    </a:stretch>
+                  </pic:blipFill>
+                  <pic:spPr>
+                    <a:xfrm>
+                      <a:off x="0" y="0"/>
+                      <a:ext cx="5669280" cy="3099206"/>
+                    </a:xfrm>
+                    <a:prstGeom prst="rect"/>
+                  </pic:spPr>
+                </pic:pic>
+              </a:graphicData>
+            </a:graphic>
+          </wp:inline>
+        </w:drawing>
+      </w:r>
+    </w:p>
+    <w:p>
+      <w:pPr>
+        <w:jc w:val="center"/>
+      </w:pPr>
+      <w:r>
+        <w:rPr>
+          <w:i/>
+          <w:sz w:val="18"/>
+        </w:rPr>
+        <w:t>Figura 6: Evidencia Real de Ejecución Concurrente en Consola (Productor Kafka y Consumidor Spark Streaming).</w:t>
+      </w:r>
+    </w:p>
+    <w:p>
+      <w:r>
+        <w:drawing>
+          <wp:inline xmlns:a="http://schemas.openxmlformats.org/drawingml/2006/main" xmlns:pic="http://schemas.openxmlformats.org/drawingml/2006/picture">
+            <wp:extent cx="5669280" cy="2227217"/>
+            <wp:docPr id="7" name="Picture 7"/>
+            <wp:cNvGraphicFramePr>
+              <a:graphicFrameLocks noChangeAspect="1"/>
+            </wp:cNvGraphicFramePr>
+            <a:graphic>
+              <a:graphicData uri="http://schemas.openxmlformats.org/drawingml/2006/picture">
+                <pic:pic>
+                  <pic:nvPicPr>
+                    <pic:cNvPr id="0" name="spark_ui_stages_crop.png"/>
+                    <pic:cNvPicPr/>
+                  </pic:nvPicPr>
+                  <pic:blipFill>
+                    <a:blip r:embed="rId15"/>
+                    <a:stretch>
+                      <a:fillRect/>
+                    </a:stretch>
+                  </pic:blipFill>
+                  <pic:spPr>
+                    <a:xfrm>
+                      <a:off x="0" y="0"/>
+                      <a:ext cx="5669280" cy="2227217"/>
+                    </a:xfrm>
+                    <a:prstGeom prst="rect"/>
+                  </pic:spPr>
+                </pic:pic>
+              </a:graphicData>
+            </a:graphic>
+          </wp:inline>
+        </w:drawing>
+      </w:r>
+    </w:p>
+    <w:p>
+      <w:pPr>
+        <w:jc w:val="center"/>
+      </w:pPr>
+      <w:r>
+        <w:rPr>
+          <w:i/>
+          <w:sz w:val="18"/>
+        </w:rPr>
+        <w:t>Figura 7: Auditoría en Tiempo Real de Jobs y Stages en Spark Web UI (http://localhost:4040).</w:t>
       </w:r>
     </w:p>
     <w:p>
@@ -1916,7 +2012,7 @@
         <w:jc w:val="both"/>
       </w:pPr>
       <w:r>
-        <w:t>Análisis Técnico (Figura 5): Se valida la ingesta continua de registros en el topic sensor_data y su posterior consumo en micro-batches. El operador de ventana deslizante consolida las medias de temperatura y humedad para cada sensor sin latencias de red, mientras la interfaz web en el puerto 4040 confirma la asignación de 2.0 GiB de RAM en el Driver y cero etapas fallidas.</w:t>
+        <w:t>Análisis Técnico (Figuras 5, 6 y 7): Se valida la ingesta continua de registros en el topic sensor_data y su posterior consumo en micro-batches. El operador de ventana deslizante consolida las medias de temperatura y humedad para cada sensor sin latencias de red, mientras la interfaz web en el puerto 4040 confirma la ejecución distribuida de los micro-batches (200 particiones) y cero etapas fallidas.</w:t>
       </w:r>
     </w:p>
     <w:p>

</xml_diff>

<commit_message>
Add final YouTube video and Google Slides links to report, presentation, and README
</commit_message>
<xml_diff>
--- a/informe/Tarea3_Grupo16_PauloDeLosReyes.docx
+++ b/informe/Tarea3_Grupo16_PauloDeLosReyes.docx
@@ -2056,7 +2056,7 @@
         <w:t xml:space="preserve">Presentación Online (Google Slides): </w:t>
       </w:r>
       <w:r>
-        <w:t>https://docs.google.com/presentation/d/1MqQRxtU3fVPnxDnB2EPuVMmHrWjVB1EWMCfo44sE74U/edit?usp=sharing (Presentación visual con el problema, arquitectura y resumen de resultados).</w:t>
+        <w:t>https://docs.google.com/presentation/d/1ky0XVas4k6nBlOhcIY3pm3_6-jkMMjMBw_3cKPN1E4A/edit?usp=sharing (Presentación ejecutiva con el problema, arquitectura, capturas reales y resultados).</w:t>
       </w:r>
     </w:p>
     <w:p>
@@ -2069,10 +2069,10 @@
         <w:rPr>
           <w:b/>
         </w:rPr>
-        <w:t xml:space="preserve">Video Explicativo de Sustentación: </w:t>
+        <w:t xml:space="preserve">Video Explicativo de Sustentación (YouTube): </w:t>
       </w:r>
       <w:r>
-        <w:t>https://youtu.be/... (Video de máximo 5 minutos con explicación y sustentación de los códigos y ejecuciones prácticas).</w:t>
+        <w:t>https://youtu.be/lX0_CDMhhbg (Video de sustentación explicando el código en batch, los resultados y el procesamiento en tiempo real del Anexo 3).</w:t>
       </w:r>
     </w:p>
     <w:p>

</xml_diff>

<commit_message>
Update video link to Google Drive across report, presentation, and README
</commit_message>
<xml_diff>
--- a/informe/Tarea3_Grupo16_PauloDeLosReyes.docx
+++ b/informe/Tarea3_Grupo16_PauloDeLosReyes.docx
@@ -2069,10 +2069,10 @@
         <w:rPr>
           <w:b/>
         </w:rPr>
-        <w:t xml:space="preserve">Video Explicativo de Sustentación (YouTube): </w:t>
+        <w:t xml:space="preserve">Video Explicativo de Sustentación (Google Drive): </w:t>
       </w:r>
       <w:r>
-        <w:t>https://youtu.be/lX0_CDMhhbg (Video de sustentación explicando el código en batch, los resultados y el procesamiento en tiempo real del Anexo 3).</w:t>
+        <w:t>https://drive.google.com/file/d/1W-Wxs7EDEc5xnfTqt0UkKGFZ4y3kINNL/view?usp=sharing (Video de sustentación explicando el código en batch, los resultados y el procesamiento en tiempo real del Anexo 3).</w:t>
       </w:r>
     </w:p>
     <w:p>

</xml_diff>

<commit_message>
Add Kafka architecture diagram and polish PDF report
</commit_message>
<xml_diff>
--- a/informe/Tarea3_Grupo16_PauloDeLosReyes.docx
+++ b/informe/Tarea3_Grupo16_PauloDeLosReyes.docx
@@ -954,6 +954,54 @@
     </w:p>
     <w:p>
       <w:r>
+        <w:drawing>
+          <wp:inline xmlns:a="http://schemas.openxmlformats.org/drawingml/2006/main" xmlns:pic="http://schemas.openxmlformats.org/drawingml/2006/picture">
+            <wp:extent cx="5669280" cy="2444552"/>
+            <wp:docPr id="1" name="Picture 1"/>
+            <wp:cNvGraphicFramePr>
+              <a:graphicFrameLocks noChangeAspect="1"/>
+            </wp:cNvGraphicFramePr>
+            <a:graphic>
+              <a:graphicData uri="http://schemas.openxmlformats.org/drawingml/2006/picture">
+                <pic:pic>
+                  <pic:nvPicPr>
+                    <pic:cNvPr id="0" name="diagrama_arquitectura_kafka.png"/>
+                    <pic:cNvPicPr/>
+                  </pic:nvPicPr>
+                  <pic:blipFill>
+                    <a:blip r:embed="rId9"/>
+                    <a:stretch>
+                      <a:fillRect/>
+                    </a:stretch>
+                  </pic:blipFill>
+                  <pic:spPr>
+                    <a:xfrm>
+                      <a:off x="0" y="0"/>
+                      <a:ext cx="5669280" cy="2444552"/>
+                    </a:xfrm>
+                    <a:prstGeom prst="rect"/>
+                  </pic:spPr>
+                </pic:pic>
+              </a:graphicData>
+            </a:graphic>
+          </wp:inline>
+        </w:drawing>
+      </w:r>
+    </w:p>
+    <w:p>
+      <w:pPr>
+        <w:jc w:val="center"/>
+      </w:pPr>
+      <w:r>
+        <w:rPr>
+          <w:i/>
+          <w:sz w:val="18"/>
+        </w:rPr>
+        <w:t>Figura 1: Diagrama de Arquitectura Distribuida de Apache Kafka integrada con Spark Structured Streaming.</w:t>
+      </w:r>
+    </w:p>
+    <w:p>
+      <w:r>
         <w:br w:type="page"/>
       </w:r>
     </w:p>
@@ -1519,7 +1567,7 @@
         <w:pStyle w:val="Heading2"/>
       </w:pPr>
       <w:r>
-        <w:t>5.1 Limpieza y Operaciones con RDDs</w:t>
+        <w:t>5.1 Limpieza, Operaciones con RDDs y Ejecución en Consola</w:t>
       </w:r>
     </w:p>
     <w:p>
@@ -1529,6 +1577,54 @@
       </w:pPr>
       <w:r>
         <w:t>Tras la depuración de nulos (obteniendo 59.091 registros válidos), el DataFrame fue convertido a RDD. Mediante la transformación filter(), se seleccionaron 9.820 registros correspondientes a PM2.5 (contados con count()). Empleando map() se estructuraron pares (departamento, (concentración, 1)) y mediante reduceByKey() se calculó el promedio por departamento de forma agregada: Atlántico (25.50 µg/m³), Santander (25.43 µg/m³), Antioquia (24.72 µg/m³), Valle del Cauca (24.72 µg/m³) y Bogotá D.C. (24.56 µg/m³), recuperados mediante la acción collect().</w:t>
+      </w:r>
+    </w:p>
+    <w:p>
+      <w:r>
+        <w:drawing>
+          <wp:inline xmlns:a="http://schemas.openxmlformats.org/drawingml/2006/main" xmlns:pic="http://schemas.openxmlformats.org/drawingml/2006/picture">
+            <wp:extent cx="5669280" cy="3099206"/>
+            <wp:docPr id="2" name="Picture 2"/>
+            <wp:cNvGraphicFramePr>
+              <a:graphicFrameLocks noChangeAspect="1"/>
+            </wp:cNvGraphicFramePr>
+            <a:graphic>
+              <a:graphicData uri="http://schemas.openxmlformats.org/drawingml/2006/picture">
+                <pic:pic>
+                  <pic:nvPicPr>
+                    <pic:cNvPr id="0" name="captura_batch_terminal_real.png"/>
+                    <pic:cNvPicPr/>
+                  </pic:nvPicPr>
+                  <pic:blipFill>
+                    <a:blip r:embed="rId10"/>
+                    <a:stretch>
+                      <a:fillRect/>
+                    </a:stretch>
+                  </pic:blipFill>
+                  <pic:spPr>
+                    <a:xfrm>
+                      <a:off x="0" y="0"/>
+                      <a:ext cx="5669280" cy="3099206"/>
+                    </a:xfrm>
+                    <a:prstGeom prst="rect"/>
+                  </pic:spPr>
+                </pic:pic>
+              </a:graphicData>
+            </a:graphic>
+          </wp:inline>
+        </w:drawing>
+      </w:r>
+    </w:p>
+    <w:p>
+      <w:pPr>
+        <w:jc w:val="center"/>
+      </w:pPr>
+      <w:r>
+        <w:rPr>
+          <w:i/>
+          <w:sz w:val="18"/>
+        </w:rPr>
+        <w:t>Figura 2: Código fuente en PySpark (batch_analysis.py) y salida real de ejecución en consola Linux.</w:t>
       </w:r>
     </w:p>
     <w:p>
@@ -1544,7 +1640,7 @@
         <w:drawing>
           <wp:inline xmlns:a="http://schemas.openxmlformats.org/drawingml/2006/main" xmlns:pic="http://schemas.openxmlformats.org/drawingml/2006/picture">
             <wp:extent cx="5669280" cy="2834640"/>
-            <wp:docPr id="1" name="Picture 1"/>
+            <wp:docPr id="3" name="Picture 3"/>
             <wp:cNvGraphicFramePr>
               <a:graphicFrameLocks noChangeAspect="1"/>
             </wp:cNvGraphicFramePr>
@@ -1556,7 +1652,7 @@
                     <pic:cNvPicPr/>
                   </pic:nvPicPr>
                   <pic:blipFill>
-                    <a:blip r:embed="rId9"/>
+                    <a:blip r:embed="rId11"/>
                     <a:stretch>
                       <a:fillRect/>
                     </a:stretch>
@@ -1601,7 +1697,7 @@
         <w:drawing>
           <wp:inline xmlns:a="http://schemas.openxmlformats.org/drawingml/2006/main" xmlns:pic="http://schemas.openxmlformats.org/drawingml/2006/picture">
             <wp:extent cx="4114800" cy="2315026"/>
-            <wp:docPr id="2" name="Picture 2"/>
+            <wp:docPr id="4" name="Picture 4"/>
             <wp:cNvGraphicFramePr>
               <a:graphicFrameLocks noChangeAspect="1"/>
             </wp:cNvGraphicFramePr>
@@ -1613,7 +1709,7 @@
                     <pic:cNvPicPr/>
                   </pic:nvPicPr>
                   <pic:blipFill>
-                    <a:blip r:embed="rId10"/>
+                    <a:blip r:embed="rId12"/>
                     <a:stretch>
                       <a:fillRect/>
                     </a:stretch>
@@ -1663,7 +1759,7 @@
         <w:drawing>
           <wp:inline xmlns:a="http://schemas.openxmlformats.org/drawingml/2006/main" xmlns:pic="http://schemas.openxmlformats.org/drawingml/2006/picture">
             <wp:extent cx="5669280" cy="2576945"/>
-            <wp:docPr id="3" name="Picture 3"/>
+            <wp:docPr id="5" name="Picture 5"/>
             <wp:cNvGraphicFramePr>
               <a:graphicFrameLocks noChangeAspect="1"/>
             </wp:cNvGraphicFramePr>
@@ -1675,7 +1771,7 @@
                     <pic:cNvPicPr/>
                   </pic:nvPicPr>
                   <pic:blipFill>
-                    <a:blip r:embed="rId11"/>
+                    <a:blip r:embed="rId13"/>
                     <a:stretch>
                       <a:fillRect/>
                     </a:stretch>
@@ -1720,7 +1816,7 @@
         <w:drawing>
           <wp:inline xmlns:a="http://schemas.openxmlformats.org/drawingml/2006/main" xmlns:pic="http://schemas.openxmlformats.org/drawingml/2006/picture">
             <wp:extent cx="5669280" cy="3149600"/>
-            <wp:docPr id="4" name="Picture 4"/>
+            <wp:docPr id="6" name="Picture 6"/>
             <wp:cNvGraphicFramePr>
               <a:graphicFrameLocks noChangeAspect="1"/>
             </wp:cNvGraphicFramePr>
@@ -1732,7 +1828,7 @@
                     <pic:cNvPicPr/>
                   </pic:nvPicPr>
                   <pic:blipFill>
-                    <a:blip r:embed="rId12"/>
+                    <a:blip r:embed="rId14"/>
                     <a:stretch>
                       <a:fillRect/>
                     </a:stretch>
@@ -1867,7 +1963,7 @@
         <w:drawing>
           <wp:inline xmlns:a="http://schemas.openxmlformats.org/drawingml/2006/main" xmlns:pic="http://schemas.openxmlformats.org/drawingml/2006/picture">
             <wp:extent cx="5669280" cy="3099206"/>
-            <wp:docPr id="5" name="Picture 5"/>
+            <wp:docPr id="7" name="Picture 7"/>
             <wp:cNvGraphicFramePr>
               <a:graphicFrameLocks noChangeAspect="1"/>
             </wp:cNvGraphicFramePr>
@@ -1879,7 +1975,7 @@
                     <pic:cNvPicPr/>
                   </pic:nvPicPr>
                   <pic:blipFill>
-                    <a:blip r:embed="rId13"/>
+                    <a:blip r:embed="rId15"/>
                     <a:stretch>
                       <a:fillRect/>
                     </a:stretch>
@@ -1915,7 +2011,7 @@
         <w:drawing>
           <wp:inline xmlns:a="http://schemas.openxmlformats.org/drawingml/2006/main" xmlns:pic="http://schemas.openxmlformats.org/drawingml/2006/picture">
             <wp:extent cx="5669280" cy="3099206"/>
-            <wp:docPr id="6" name="Picture 6"/>
+            <wp:docPr id="8" name="Picture 8"/>
             <wp:cNvGraphicFramePr>
               <a:graphicFrameLocks noChangeAspect="1"/>
             </wp:cNvGraphicFramePr>
@@ -1927,7 +2023,7 @@
                     <pic:cNvPicPr/>
                   </pic:nvPicPr>
                   <pic:blipFill>
-                    <a:blip r:embed="rId14"/>
+                    <a:blip r:embed="rId16"/>
                     <a:stretch>
                       <a:fillRect/>
                     </a:stretch>
@@ -1963,7 +2059,7 @@
         <w:drawing>
           <wp:inline xmlns:a="http://schemas.openxmlformats.org/drawingml/2006/main" xmlns:pic="http://schemas.openxmlformats.org/drawingml/2006/picture">
             <wp:extent cx="5669280" cy="2227217"/>
-            <wp:docPr id="7" name="Picture 7"/>
+            <wp:docPr id="9" name="Picture 9"/>
             <wp:cNvGraphicFramePr>
               <a:graphicFrameLocks noChangeAspect="1"/>
             </wp:cNvGraphicFramePr>
@@ -1975,7 +2071,7 @@
                     <pic:cNvPicPr/>
                   </pic:nvPicPr>
                   <pic:blipFill>
-                    <a:blip r:embed="rId15"/>
+                    <a:blip r:embed="rId17"/>
                     <a:stretch>
                       <a:fillRect/>
                     </a:stretch>

</xml_diff>

<commit_message>
Sync Word docx figure numbering and formatting with PDF
</commit_message>
<xml_diff>
--- a/informe/Tarea3_Grupo16_PauloDeLosReyes.docx
+++ b/informe/Tarea3_Grupo16_PauloDeLosReyes.docx
@@ -902,20 +902,46 @@
     </w:p>
     <w:p>
       <w:pPr>
-        <w:spacing w:line="276" w:lineRule="auto" w:before="80"/>
+        <w:spacing w:before="120" w:after="40"/>
+        <w:jc w:val="left"/>
+      </w:pPr>
+      <w:r>
+        <w:rPr>
+          <w:b/>
+        </w:rPr>
+        <w:t>Operaciones sobre RDDs:</w:t>
+      </w:r>
+    </w:p>
+    <w:p>
+      <w:pPr>
+        <w:pStyle w:val="ListBullet"/>
+        <w:spacing w:line="276" w:lineRule="auto" w:after="60"/>
         <w:jc w:val="both"/>
       </w:pPr>
       <w:r>
         <w:rPr>
           <w:b/>
         </w:rPr>
-        <w:t>Operaciones sobre RDDs:</w:t>
-        <w:br/>
+        <w:t xml:space="preserve">Transformaciones: </w:t>
       </w:r>
       <w:r>
-        <w:t>• Transformaciones: map (mapeo unario 1-a-1), filter (filtrado mediante predicado booleano), flatMap (mapeo y aplanamiento de colecciones), groupByKey (agrupación por clave requiriendo fase de shuffle masivo en red) y reduceByKey (agregación asociativa local previa al shuffle, óptima en red).</w:t>
-        <w:br/>
-        <w:t>• Acciones: collect (retorna todo el conjunto al programa conductor), count (retorna el número total de registros), take (retorna los primeros n registros optimizando la lectura) y reduce (agrega elementos mediante función binaria).</w:t>
+        <w:t>map (mapeo unario 1-a-1), filter (filtrado mediante predicado booleano), flatMap (mapeo y aplanamiento de colecciones), groupByKey (agrupación por clave requiriendo fase de shuffle masivo en red) y reduceByKey (agregación asociativa local previa al shuffle, óptima en red).</w:t>
+      </w:r>
+    </w:p>
+    <w:p>
+      <w:pPr>
+        <w:pStyle w:val="ListBullet"/>
+        <w:spacing w:line="276" w:lineRule="auto" w:after="80"/>
+        <w:jc w:val="both"/>
+      </w:pPr>
+      <w:r>
+        <w:rPr>
+          <w:b/>
+        </w:rPr>
+        <w:t xml:space="preserve">Acciones: </w:t>
+      </w:r>
+      <w:r>
+        <w:t>collect (retorna todo el conjunto al programa conductor), count (retorna el número total de registros), take (retorna los primeros n registros optimizando la lectura) y reduce (agrega elementos mediante función binaria).</w:t>
       </w:r>
     </w:p>
     <w:p>
@@ -1680,7 +1706,7 @@
           <w:i/>
           <w:sz w:val="18"/>
         </w:rPr>
-        <w:t>Figura 1: Concentración Promedio de Material Particulado (PM2.5 y PM10) por Departamento en Colombia.</w:t>
+        <w:t>Figura 3: Concentración Promedio de Material Particulado (PM2.5 y PM10) por Departamento en Colombia.</w:t>
       </w:r>
     </w:p>
     <w:p>
@@ -1689,14 +1715,14 @@
         <w:jc w:val="both"/>
       </w:pPr>
       <w:r>
-        <w:t>Análisis Técnico (Figura 1): La relación estequiométrica entre PM10 y PM2.5 se mantiene consistente en todas las regiones, duplicando las partículas gruesas a las finas. El departamento del Atlántico encabeza las concentraciones debido a condiciones eólicas y tráfico portuario, seguido estrechamente por Santander y Bogotá.</w:t>
+        <w:t>Análisis Técnico (Figura 3): La relación estequiométrica entre PM10 y PM2.5 se mantiene consistente en todas las regiones, duplicando las partículas gruesas a las finas. El departamento del Atlántico encabeza las concentraciones debido a condiciones eólicas y tráfico portuario, seguido estrechamente por Santander y Bogotá.</w:t>
       </w:r>
     </w:p>
     <w:p>
       <w:r>
         <w:drawing>
           <wp:inline xmlns:a="http://schemas.openxmlformats.org/drawingml/2006/main" xmlns:pic="http://schemas.openxmlformats.org/drawingml/2006/picture">
-            <wp:extent cx="4114800" cy="2315026"/>
+            <wp:extent cx="5029200" cy="2829476"/>
             <wp:docPr id="4" name="Picture 4"/>
             <wp:cNvGraphicFramePr>
               <a:graphicFrameLocks noChangeAspect="1"/>
@@ -1717,7 +1743,7 @@
                   <pic:spPr>
                     <a:xfrm>
                       <a:off x="0" y="0"/>
-                      <a:ext cx="4114800" cy="2315026"/>
+                      <a:ext cx="5029200" cy="2829476"/>
                     </a:xfrm>
                     <a:prstGeom prst="rect"/>
                   </pic:spPr>
@@ -1737,7 +1763,7 @@
           <w:i/>
           <w:sz w:val="18"/>
         </w:rPr>
-        <w:t>Figura 2: Distribución Porcentual del Índice de Calidad del Aire (ICA) en Colombia.</w:t>
+        <w:t>Figura 4: Distribución Porcentual del Índice de Calidad del Aire (ICA) en Colombia.</w:t>
       </w:r>
     </w:p>
     <w:p>
@@ -1746,7 +1772,7 @@
         <w:jc w:val="both"/>
       </w:pPr>
       <w:r>
-        <w:t>Análisis Técnico (Figura 2): El 70.6% de los eventos monitoreados se ubica en rango 'Bueno' y el 26.3% en 'Aceptable'. Sin embargo, el 2.9% se categoriza como 'Dañina a Grupos Sensibles' y un 0.1% como 'Dañina', delimitando los momentos de emergencia donde la población vulnerable debe limitar su actividad al aire libre.</w:t>
+        <w:t>Análisis Técnico (Figura 4): El 70.6% de los eventos monitoreados se ubica en rango 'Bueno' y el 26.3% en 'Aceptable'. Sin embargo, el 2.9% se categoriza como 'Dañina a Grupos Sensibles' y un 0.1% como 'Dañina', delimitando los momentos de emergencia donde la población vulnerable debe limitar su actividad al aire libre.</w:t>
       </w:r>
     </w:p>
     <w:p>
@@ -1799,7 +1825,7 @@
           <w:i/>
           <w:sz w:val="18"/>
         </w:rPr>
-        <w:t>Figura 3: Top 7 Estaciones de Monitoreo con Mayor Concentración Crítica de PM2.5.</w:t>
+        <w:t>Figura 5: Top 7 Estaciones de Monitoreo con Mayor Concentración Crítica de PM2.5.</w:t>
       </w:r>
     </w:p>
     <w:p>
@@ -1808,7 +1834,7 @@
         <w:jc w:val="both"/>
       </w:pPr>
       <w:r>
-        <w:t>Análisis Técnico (Figura 3): La estación Centro Histórico de Barranquilla registra el promedio más alto (25.69 µg/m³), seguida por Centro Bucaramanga (25.66 µg/m³) y Ciudadela Real de Minas (25.39 µg/m³), superando la línea guía preventiva recomendada.</w:t>
+        <w:t>Análisis Técnico (Figura 5): La estación Centro Histórico de Barranquilla registra el promedio más alto (25.69 µg/m³), seguida por Centro Bucaramanga (25.66 µg/m³) y Ciudadela Real de Minas (25.39 µg/m³), superando la línea guía preventiva recomendada.</w:t>
       </w:r>
     </w:p>
     <w:p>
@@ -1856,7 +1882,7 @@
           <w:i/>
           <w:sz w:val="18"/>
         </w:rPr>
-        <w:t>Figura 4: Dispersión de Concentración PM2.5 según Temperatura y Humedad Relativa.</w:t>
+        <w:t>Figura 6: Dispersión de Concentración PM2.5 según Temperatura y Humedad Relativa.</w:t>
       </w:r>
     </w:p>
     <w:p>
@@ -1865,7 +1891,7 @@
         <w:jc w:val="both"/>
       </w:pPr>
       <w:r>
-        <w:t>Análisis Técnico (Figura 4): Se comprueba una mayor aglomeración de registros de polución elevada en condiciones de menor temperatura y humedad relativa alta (&gt;70%), lo cual refleja empíricamente la retención de contaminantes por inversión térmica.</w:t>
+        <w:t>Análisis Técnico (Figura 6): Se comprueba una mayor aglomeración de registros de polución elevada en condiciones de menor temperatura y humedad relativa alta (&gt;70%), lo cual refleja empíricamente la retención de contaminantes por inversión térmica.</w:t>
       </w:r>
     </w:p>
     <w:p>
@@ -2003,7 +2029,7 @@
           <w:i/>
           <w:sz w:val="18"/>
         </w:rPr>
-        <w:t>Figura 5: Arranque de ZooKeeper, Kafka Server, creación del topic sensor_data e implementación de scripts en Linux.</w:t>
+        <w:t>Figura 7: Arranque de ZooKeeper, Kafka Server, creación del topic sensor_data e implementación de scripts en Linux.</w:t>
       </w:r>
     </w:p>
     <w:p>
@@ -2051,7 +2077,7 @@
           <w:i/>
           <w:sz w:val="18"/>
         </w:rPr>
-        <w:t>Figura 6: Evidencia Real de Ejecución Concurrente en Consola (Productor Kafka y Consumidor Spark Streaming).</w:t>
+        <w:t>Figura 8: Evidencia Real de Ejecución Concurrente en Consola (Productor Kafka y Consumidor Spark Streaming).</w:t>
       </w:r>
     </w:p>
     <w:p>
@@ -2099,7 +2125,7 @@
           <w:i/>
           <w:sz w:val="18"/>
         </w:rPr>
-        <w:t>Figura 7: Auditoría en Tiempo Real de Jobs y Stages en Spark Web UI (http://localhost:4040).</w:t>
+        <w:t>Figura 9: Auditoría en Tiempo Real de Jobs y Stages en Spark Web UI (http://localhost:4040).</w:t>
       </w:r>
     </w:p>
     <w:p>
@@ -2108,7 +2134,7 @@
         <w:jc w:val="both"/>
       </w:pPr>
       <w:r>
-        <w:t>Análisis Técnico (Figuras 5, 6 y 7): Se valida la ingesta continua de registros en el topic sensor_data y su posterior consumo en micro-batches. El operador de ventana deslizante consolida las medias de temperatura y humedad para cada sensor sin latencias de red, mientras la interfaz web en el puerto 4040 confirma la ejecución distribuida de los micro-batches (200 particiones) y cero etapas fallidas.</w:t>
+        <w:t>Análisis Técnico (Figuras 7, 8 y 9): Se valida la ingesta continua de registros en el topic sensor_data y su posterior consumo en micro-batches. El operador de ventana deslizante consolida las medias de temperatura y humedad para cada sensor sin latencias de red, mientras la interfaz web en el puerto 4040 confirma la ejecución distribuida de los micro-batches (200 particiones) y cero etapas fallidas.</w:t>
       </w:r>
     </w:p>
     <w:p>
@@ -2127,7 +2153,7 @@
       <w:pPr>
         <w:pStyle w:val="ListBullet"/>
         <w:spacing w:line="276" w:lineRule="auto" w:after="80"/>
-        <w:jc w:val="both"/>
+        <w:jc w:val="left"/>
       </w:pPr>
       <w:r>
         <w:rPr>
@@ -2136,14 +2162,14 @@
         <w:t xml:space="preserve">Repositorio GitHub: </w:t>
       </w:r>
       <w:r>
-        <w:t>https://github.com/paulodelosrey/UNAD-BigData-Tarea3-Spark-Streaming (Contiene batch_analysis.py, kafka_producer.py, spark_streaming_consumer.py, dataset y README.md).</w:t>
+        <w:t>https://github.com/paulodelosrey/UNAD-BigData-Tarea3-Spark-Streaming</w:t>
       </w:r>
     </w:p>
     <w:p>
       <w:pPr>
         <w:pStyle w:val="ListBullet"/>
         <w:spacing w:line="276" w:lineRule="auto" w:after="80"/>
-        <w:jc w:val="both"/>
+        <w:jc w:val="left"/>
       </w:pPr>
       <w:r>
         <w:rPr>
@@ -2152,14 +2178,14 @@
         <w:t xml:space="preserve">Presentación Online (Google Slides): </w:t>
       </w:r>
       <w:r>
-        <w:t>https://docs.google.com/presentation/d/1ky0XVas4k6nBlOhcIY3pm3_6-jkMMjMBw_3cKPN1E4A/edit?usp=sharing (Presentación ejecutiva con el problema, arquitectura, capturas reales y resultados).</w:t>
+        <w:t>https://docs.google.com/presentation/d/1ky0XVas4k6nBlOhcIY3pm3_6-jkMMjMBw_3cKPN1E4A/edit?usp=sharing</w:t>
       </w:r>
     </w:p>
     <w:p>
       <w:pPr>
         <w:pStyle w:val="ListBullet"/>
         <w:spacing w:line="276" w:lineRule="auto" w:after="80"/>
-        <w:jc w:val="both"/>
+        <w:jc w:val="left"/>
       </w:pPr>
       <w:r>
         <w:rPr>
@@ -2168,7 +2194,7 @@
         <w:t xml:space="preserve">Video Explicativo de Sustentación (Google Drive): </w:t>
       </w:r>
       <w:r>
-        <w:t>https://drive.google.com/file/d/1W-Wxs7EDEc5xnfTqt0UkKGFZ4y3kINNL/view?usp=sharing (Video de sustentación explicando el código en batch, los resultados y el procesamiento en tiempo real del Anexo 3).</w:t>
+        <w:t>https://drive.google.com/file/d/1W-Wxs7EDEc5xnfTqt0UkKGFZ4y3kINNL/view?usp=sharing</w:t>
       </w:r>
     </w:p>
     <w:p>

</xml_diff>